<commit_message>
docs: add repositorio de 5 alunos
</commit_message>
<xml_diff>
--- a/Aula2/Ferramentas_Desenvolvimento_Frontend.docx
+++ b/Aula2/Ferramentas_Desenvolvimento_Frontend.docx
@@ -30,9 +30,20 @@
             <w:pPr>
               <w:pStyle w:val="Normal"/>
               <w:spacing w:before="0" w:after="200"/>
-              <w:jc w:val="center"/>
-              <w:rPr/>
-            </w:pPr>
+              <w:jc w:val="both"/>
+              <w:rPr/>
+            </w:pPr>
+            <w:r>
+              <w:rPr>
+                <w:rFonts w:eastAsia="Arial" w:cs="Arial"/>
+                <w:b/>
+                <w:bCs/>
+                <w:color w:val="B8D4F0"/>
+                <w:sz w:val="20"/>
+                <w:szCs w:val="20"/>
+              </w:rPr>
+              <w:softHyphen/>
+            </w:r>
             <w:r>
               <w:rPr>
                 <w:rFonts w:eastAsia="Arial" w:cs="Arial"/>
@@ -524,6 +535,11 @@
                 <w:rStyle w:val="Vnculodendice"/>
               </w:rPr>
               <w:t>1. Cronograma da Aula</w:t>
+            </w:r>
+            <w:r>
+              <w:rPr>
+                <w:rStyle w:val="Vnculodendice"/>
+              </w:rPr>
               <w:tab/>
               <w:t>3</w:t>
             </w:r>
@@ -6582,7 +6598,9 @@
         </w:tc>
       </w:tr>
       <w:tr>
-        <w:trPr/>
+        <w:trPr>
+          <w:trHeight w:val="428" w:hRule="atLeast"/>
+        </w:trPr>
         <w:tc>
           <w:tcPr>
             <w:tcW w:w="2998" w:type="dxa"/>
@@ -8003,29 +8021,7 @@
           <w:sz w:val="28"/>
           <w:szCs w:val="28"/>
         </w:rPr>
-        <w:t>6.</w:t>
-      </w:r>
-      <w:r>
-        <w:rPr>
-          <w:rFonts w:eastAsia="Arial" w:cs="Arial"/>
-          <w:b/>
-          <w:bCs/>
-          <w:color w:val="2E6DA4"/>
-          <w:sz w:val="28"/>
-          <w:szCs w:val="28"/>
-        </w:rPr>
-        <w:t>4</w:t>
-      </w:r>
-      <w:r>
-        <w:rPr>
-          <w:rFonts w:eastAsia="Arial" w:cs="Arial"/>
-          <w:b/>
-          <w:bCs/>
-          <w:color w:val="2E6DA4"/>
-          <w:sz w:val="28"/>
-          <w:szCs w:val="28"/>
-        </w:rPr>
-        <w:t>. Instalando e configurando o Prettier</w:t>
+        <w:t>6.4. Instalando e configurando o Prettier</w:t>
       </w:r>
     </w:p>
     <w:tbl>
@@ -8261,7 +8257,9 @@
         <w:gridCol w:w="9360"/>
       </w:tblGrid>
       <w:tr>
-        <w:trPr/>
+        <w:trPr>
+          <w:trHeight w:val="2181" w:hRule="atLeast"/>
+        </w:trPr>
         <w:tc>
           <w:tcPr>
             <w:tcW w:w="9360" w:type="dxa"/>
@@ -9211,29 +9209,7 @@
           <w:sz w:val="28"/>
           <w:szCs w:val="28"/>
         </w:rPr>
-        <w:t>6.</w:t>
-      </w:r>
-      <w:r>
-        <w:rPr>
-          <w:rFonts w:eastAsia="Arial" w:cs="Arial"/>
-          <w:b/>
-          <w:bCs/>
-          <w:color w:val="2E6DA4"/>
-          <w:sz w:val="28"/>
-          <w:szCs w:val="28"/>
-        </w:rPr>
-        <w:t>5</w:t>
-      </w:r>
-      <w:r>
-        <w:rPr>
-          <w:rFonts w:eastAsia="Arial" w:cs="Arial"/>
-          <w:b/>
-          <w:bCs/>
-          <w:color w:val="2E6DA4"/>
-          <w:sz w:val="28"/>
-          <w:szCs w:val="28"/>
-        </w:rPr>
-        <w:t>. Introdução ao Husky + lint-staged</w:t>
+        <w:t>6.5. Introdução ao Husky + lint-staged</w:t>
       </w:r>
     </w:p>
     <w:p>
@@ -13451,15 +13427,15 @@
         <w:tblLook w:val="0000"/>
       </w:tblPr>
       <w:tblGrid>
-        <w:gridCol w:w="2196"/>
-        <w:gridCol w:w="3580"/>
+        <w:gridCol w:w="2195"/>
+        <w:gridCol w:w="3581"/>
         <w:gridCol w:w="3584"/>
       </w:tblGrid>
       <w:tr>
         <w:trPr/>
         <w:tc>
           <w:tcPr>
-            <w:tcW w:w="2196" w:type="dxa"/>
+            <w:tcW w:w="2195" w:type="dxa"/>
             <w:tcBorders>
               <w:top w:val="single" w:sz="2" w:space="0" w:color="CCCCCC"/>
               <w:left w:val="single" w:sz="2" w:space="0" w:color="CCCCCC"/>
@@ -13488,7 +13464,7 @@
         </w:tc>
         <w:tc>
           <w:tcPr>
-            <w:tcW w:w="3580" w:type="dxa"/>
+            <w:tcW w:w="3581" w:type="dxa"/>
             <w:tcBorders>
               <w:top w:val="single" w:sz="2" w:space="0" w:color="CCCCCC"/>
               <w:left w:val="single" w:sz="2" w:space="0" w:color="CCCCCC"/>
@@ -13549,7 +13525,7 @@
         <w:trPr/>
         <w:tc>
           <w:tcPr>
-            <w:tcW w:w="2196" w:type="dxa"/>
+            <w:tcW w:w="2195" w:type="dxa"/>
             <w:tcBorders>
               <w:top w:val="single" w:sz="2" w:space="0" w:color="CCCCCC"/>
               <w:left w:val="single" w:sz="2" w:space="0" w:color="CCCCCC"/>
@@ -13578,7 +13554,7 @@
         </w:tc>
         <w:tc>
           <w:tcPr>
-            <w:tcW w:w="3580" w:type="dxa"/>
+            <w:tcW w:w="3581" w:type="dxa"/>
             <w:tcBorders>
               <w:top w:val="single" w:sz="2" w:space="0" w:color="CCCCCC"/>
               <w:left w:val="single" w:sz="2" w:space="0" w:color="CCCCCC"/>
@@ -13635,7 +13611,7 @@
         <w:trPr/>
         <w:tc>
           <w:tcPr>
-            <w:tcW w:w="2196" w:type="dxa"/>
+            <w:tcW w:w="2195" w:type="dxa"/>
             <w:tcBorders>
               <w:top w:val="single" w:sz="2" w:space="0" w:color="CCCCCC"/>
               <w:left w:val="single" w:sz="2" w:space="0" w:color="CCCCCC"/>
@@ -13664,7 +13640,7 @@
         </w:tc>
         <w:tc>
           <w:tcPr>
-            <w:tcW w:w="3580" w:type="dxa"/>
+            <w:tcW w:w="3581" w:type="dxa"/>
             <w:tcBorders>
               <w:top w:val="single" w:sz="2" w:space="0" w:color="CCCCCC"/>
               <w:left w:val="single" w:sz="2" w:space="0" w:color="CCCCCC"/>
@@ -13721,7 +13697,7 @@
         <w:trPr/>
         <w:tc>
           <w:tcPr>
-            <w:tcW w:w="2196" w:type="dxa"/>
+            <w:tcW w:w="2195" w:type="dxa"/>
             <w:tcBorders>
               <w:top w:val="single" w:sz="2" w:space="0" w:color="CCCCCC"/>
               <w:left w:val="single" w:sz="2" w:space="0" w:color="CCCCCC"/>
@@ -13750,7 +13726,7 @@
         </w:tc>
         <w:tc>
           <w:tcPr>
-            <w:tcW w:w="3580" w:type="dxa"/>
+            <w:tcW w:w="3581" w:type="dxa"/>
             <w:tcBorders>
               <w:top w:val="single" w:sz="2" w:space="0" w:color="CCCCCC"/>
               <w:left w:val="single" w:sz="2" w:space="0" w:color="CCCCCC"/>
@@ -13807,7 +13783,7 @@
         <w:trPr/>
         <w:tc>
           <w:tcPr>
-            <w:tcW w:w="2196" w:type="dxa"/>
+            <w:tcW w:w="2195" w:type="dxa"/>
             <w:tcBorders>
               <w:top w:val="single" w:sz="2" w:space="0" w:color="CCCCCC"/>
               <w:left w:val="single" w:sz="2" w:space="0" w:color="CCCCCC"/>
@@ -13836,7 +13812,7 @@
         </w:tc>
         <w:tc>
           <w:tcPr>
-            <w:tcW w:w="3580" w:type="dxa"/>
+            <w:tcW w:w="3581" w:type="dxa"/>
             <w:tcBorders>
               <w:top w:val="single" w:sz="2" w:space="0" w:color="CCCCCC"/>
               <w:left w:val="single" w:sz="2" w:space="0" w:color="CCCCCC"/>
@@ -13893,7 +13869,7 @@
         <w:trPr/>
         <w:tc>
           <w:tcPr>
-            <w:tcW w:w="2196" w:type="dxa"/>
+            <w:tcW w:w="2195" w:type="dxa"/>
             <w:tcBorders>
               <w:top w:val="single" w:sz="2" w:space="0" w:color="CCCCCC"/>
               <w:left w:val="single" w:sz="2" w:space="0" w:color="CCCCCC"/>
@@ -13922,7 +13898,7 @@
         </w:tc>
         <w:tc>
           <w:tcPr>
-            <w:tcW w:w="3580" w:type="dxa"/>
+            <w:tcW w:w="3581" w:type="dxa"/>
             <w:tcBorders>
               <w:top w:val="single" w:sz="2" w:space="0" w:color="CCCCCC"/>
               <w:left w:val="single" w:sz="2" w:space="0" w:color="CCCCCC"/>
@@ -13979,7 +13955,7 @@
         <w:trPr/>
         <w:tc>
           <w:tcPr>
-            <w:tcW w:w="2196" w:type="dxa"/>
+            <w:tcW w:w="2195" w:type="dxa"/>
             <w:tcBorders>
               <w:top w:val="single" w:sz="2" w:space="0" w:color="CCCCCC"/>
               <w:left w:val="single" w:sz="2" w:space="0" w:color="CCCCCC"/>
@@ -14008,7 +13984,7 @@
         </w:tc>
         <w:tc>
           <w:tcPr>
-            <w:tcW w:w="3580" w:type="dxa"/>
+            <w:tcW w:w="3581" w:type="dxa"/>
             <w:tcBorders>
               <w:top w:val="single" w:sz="2" w:space="0" w:color="CCCCCC"/>
               <w:left w:val="single" w:sz="2" w:space="0" w:color="CCCCCC"/>
@@ -14065,7 +14041,7 @@
         <w:trPr/>
         <w:tc>
           <w:tcPr>
-            <w:tcW w:w="2196" w:type="dxa"/>
+            <w:tcW w:w="2195" w:type="dxa"/>
             <w:tcBorders>
               <w:top w:val="single" w:sz="2" w:space="0" w:color="CCCCCC"/>
               <w:left w:val="single" w:sz="2" w:space="0" w:color="CCCCCC"/>
@@ -14094,7 +14070,7 @@
         </w:tc>
         <w:tc>
           <w:tcPr>
-            <w:tcW w:w="3580" w:type="dxa"/>
+            <w:tcW w:w="3581" w:type="dxa"/>
             <w:tcBorders>
               <w:top w:val="single" w:sz="2" w:space="0" w:color="CCCCCC"/>
               <w:left w:val="single" w:sz="2" w:space="0" w:color="CCCCCC"/>
@@ -14280,7 +14256,9 @@
           <w:sz w:val="22"/>
           <w:szCs w:val="22"/>
         </w:rPr>
-        <w:t>Crie uma nova branch a partir da principal (main) com o nome feature-ferramentas-desenvolvimento;</w:t>
+        <w:t>Crie uma nova branch a partir da principal (main) com o nome feature-ferramentas-</w:t>
+        <w:tab/>
+        <w:t>desenvolvimento;</w:t>
       </w:r>
     </w:p>
     <w:p>
@@ -14976,7 +14954,7 @@
               <w:sz w:val="18"/>
               <w:szCs w:val="18"/>
             </w:rPr>
-            <w:t xml:space="preserve">Pagina </w:t>
+            <w:t xml:space="preserve">rPagina </w:t>
           </w:r>
           <w:r>
             <w:rPr/>
@@ -15101,7 +15079,7 @@
               <w:sz w:val="18"/>
               <w:szCs w:val="18"/>
             </w:rPr>
-            <w:t xml:space="preserve">Pagina </w:t>
+            <w:t xml:space="preserve">rPagina </w:t>
           </w:r>
           <w:r>
             <w:rPr/>
@@ -16739,7 +16717,7 @@
   </w:style>
   <w:style w:type="paragraph" w:styleId="Heading1">
     <w:name w:val="heading 1"/>
-    <w:basedOn w:val="Ttulo"/>
+    <w:basedOn w:val="Ttulouser"/>
     <w:qFormat/>
     <w:pPr>
       <w:spacing w:before="360" w:after="200"/>
@@ -16756,7 +16734,7 @@
   </w:style>
   <w:style w:type="paragraph" w:styleId="Heading2">
     <w:name w:val="heading 2"/>
-    <w:basedOn w:val="Ttulo"/>
+    <w:basedOn w:val="Ttulouser"/>
     <w:qFormat/>
     <w:pPr>
       <w:spacing w:before="280" w:after="120"/>
@@ -16773,7 +16751,7 @@
   </w:style>
   <w:style w:type="paragraph" w:styleId="Heading3">
     <w:name w:val="heading 3"/>
-    <w:basedOn w:val="Ttulo"/>
+    <w:basedOn w:val="Ttulouser"/>
     <w:qFormat/>
     <w:pPr>
       <w:spacing w:before="200" w:after="80"/>
@@ -16790,7 +16768,7 @@
   </w:style>
   <w:style w:type="paragraph" w:styleId="Heading4">
     <w:name w:val="heading 4"/>
-    <w:basedOn w:val="Ttulo"/>
+    <w:basedOn w:val="Ttulouser"/>
     <w:qFormat/>
     <w:pPr/>
     <w:rPr>
@@ -16801,7 +16779,7 @@
   </w:style>
   <w:style w:type="paragraph" w:styleId="Heading5">
     <w:name w:val="heading 5"/>
-    <w:basedOn w:val="Ttulo"/>
+    <w:basedOn w:val="Ttulouser"/>
     <w:qFormat/>
     <w:pPr/>
     <w:rPr>
@@ -16810,7 +16788,7 @@
   </w:style>
   <w:style w:type="paragraph" w:styleId="Heading6">
     <w:name w:val="heading 6"/>
-    <w:basedOn w:val="Ttulo"/>
+    <w:basedOn w:val="Ttulouser"/>
     <w:qFormat/>
     <w:pPr/>
     <w:rPr>
@@ -16826,8 +16804,8 @@
       <w:u w:val="single"/>
     </w:rPr>
   </w:style>
-  <w:style w:type="character" w:styleId="Caracteresdenotaderodap">
-    <w:name w:val="Caracteres de nota de rodapé"/>
+  <w:style w:type="character" w:styleId="Caracteresdenotaderodapuser">
+    <w:name w:val="Caracteres de nota de rodapé (user)"/>
     <w:uiPriority w:val="99"/>
     <w:semiHidden/>
     <w:unhideWhenUsed/>
@@ -16836,8 +16814,8 @@
       <w:vertAlign w:val="superscript"/>
     </w:rPr>
   </w:style>
-  <w:style w:type="character" w:styleId="Caracteresdenotaderodapuser">
-    <w:name w:val="Caracteres de nota de rodapé (user)"/>
+  <w:style w:type="character" w:styleId="Caracteresdenotaderodap">
+    <w:name w:val="Caracteres de nota de rodapé"/>
     <w:qFormat/>
     <w:rPr>
       <w:vertAlign w:val="superscript"/>
@@ -16860,30 +16838,30 @@
       <w:szCs w:val="20"/>
     </w:rPr>
   </w:style>
-  <w:style w:type="character" w:styleId="Smbolosdenumerao">
-    <w:name w:val="Símbolos de numeração"/>
+  <w:style w:type="character" w:styleId="Smbolosdenumeraouser">
+    <w:name w:val="Símbolos de numeração (user)"/>
     <w:qFormat/>
     <w:rPr/>
+  </w:style>
+  <w:style w:type="character" w:styleId="Vnculodendice">
+    <w:name w:val="Vínculo de índice"/>
+    <w:qFormat/>
+    <w:rPr/>
+  </w:style>
+  <w:style w:type="character" w:styleId="Marcadores">
+    <w:name w:val="Marcadores"/>
+    <w:qFormat/>
+    <w:rPr>
+      <w:rFonts w:ascii="OpenSymbol" w:hAnsi="OpenSymbol" w:eastAsia="OpenSymbol" w:cs="OpenSymbol"/>
+    </w:rPr>
   </w:style>
   <w:style w:type="character" w:styleId="Vnculodendiceuser">
     <w:name w:val="Vínculo de índice (user)"/>
     <w:qFormat/>
     <w:rPr/>
   </w:style>
-  <w:style w:type="character" w:styleId="Marcadoresuser">
-    <w:name w:val="Marcadores (user)"/>
-    <w:qFormat/>
-    <w:rPr>
-      <w:rFonts w:ascii="OpenSymbol" w:hAnsi="OpenSymbol" w:eastAsia="OpenSymbol" w:cs="OpenSymbol"/>
-    </w:rPr>
-  </w:style>
-  <w:style w:type="character" w:styleId="Vnculodendice">
-    <w:name w:val="Vínculo de índice"/>
-    <w:qFormat/>
-    <w:rPr/>
-  </w:style>
-  <w:style w:type="character" w:styleId="Cdigo-fonteuser">
-    <w:name w:val="Código-fonte (user)"/>
+  <w:style w:type="character" w:styleId="Cdigo-fonte">
+    <w:name w:val="Código-fonte"/>
     <w:qFormat/>
     <w:rPr>
       <w:rFonts w:ascii="Liberation Mono" w:hAnsi="Liberation Mono" w:eastAsia="Noto Sans Mono CJK SC" w:cs="Liberation Mono"/>
@@ -16975,7 +16953,7 @@
   </w:style>
   <w:style w:type="paragraph" w:styleId="Title">
     <w:name w:val="Title"/>
-    <w:basedOn w:val="Ttulo"/>
+    <w:basedOn w:val="Ttulouser"/>
     <w:qFormat/>
     <w:pPr/>
     <w:rPr>
@@ -17038,6 +17016,13 @@
       <w:szCs w:val="20"/>
     </w:rPr>
   </w:style>
+  <w:style w:type="paragraph" w:styleId="Cabealhoerodapuser">
+    <w:name w:val="Cabeçalho e rodapé (user)"/>
+    <w:basedOn w:val="Normal"/>
+    <w:qFormat/>
+    <w:pPr/>
+    <w:rPr/>
+  </w:style>
   <w:style w:type="paragraph" w:styleId="Cabealhoerodap">
     <w:name w:val="Cabeçalho e rodapé"/>
     <w:basedOn w:val="Normal"/>
@@ -17045,28 +17030,21 @@
     <w:pPr/>
     <w:rPr/>
   </w:style>
-  <w:style w:type="paragraph" w:styleId="Cabealhoerodapuser">
-    <w:name w:val="Cabeçalho e rodapé (user)"/>
-    <w:basedOn w:val="Normal"/>
-    <w:qFormat/>
-    <w:pPr/>
-    <w:rPr/>
-  </w:style>
   <w:style w:type="paragraph" w:styleId="Header">
     <w:name w:val="header"/>
-    <w:basedOn w:val="Cabealhoerodap"/>
+    <w:basedOn w:val="Cabealhoerodapuser"/>
     <w:pPr/>
     <w:rPr/>
   </w:style>
   <w:style w:type="paragraph" w:styleId="Footer">
     <w:name w:val="footer"/>
-    <w:basedOn w:val="Cabealhoerodap"/>
+    <w:basedOn w:val="Cabealhoerodapuser"/>
     <w:pPr/>
     <w:rPr/>
   </w:style>
   <w:style w:type="paragraph" w:styleId="IndexHeading">
     <w:name w:val="index heading"/>
-    <w:basedOn w:val="Ttulouser"/>
+    <w:basedOn w:val="Ttulo"/>
     <w:pPr>
       <w:suppressLineNumbers/>
       <w:ind w:hanging="0" w:left="0"/>
@@ -17095,7 +17073,7 @@
   </w:style>
   <w:style w:type="paragraph" w:styleId="TOC1">
     <w:name w:val="toc 1"/>
-    <w:basedOn w:val="ndiceuser"/>
+    <w:basedOn w:val="ndice"/>
     <w:pPr>
       <w:tabs>
         <w:tab w:val="clear" w:pos="720"/>
@@ -17107,7 +17085,7 @@
   </w:style>
   <w:style w:type="paragraph" w:styleId="TOC2">
     <w:name w:val="toc 2"/>
-    <w:basedOn w:val="ndiceuser"/>
+    <w:basedOn w:val="ndice"/>
     <w:pPr>
       <w:tabs>
         <w:tab w:val="clear" w:pos="720"/>
@@ -17119,7 +17097,7 @@
   </w:style>
   <w:style w:type="paragraph" w:styleId="TOC3">
     <w:name w:val="toc 3"/>
-    <w:basedOn w:val="ndiceuser"/>
+    <w:basedOn w:val="ndice"/>
     <w:pPr>
       <w:tabs>
         <w:tab w:val="clear" w:pos="720"/>
@@ -17129,8 +17107,8 @@
     </w:pPr>
     <w:rPr/>
   </w:style>
-  <w:style w:type="paragraph" w:styleId="Textoprformatadouser">
-    <w:name w:val="Texto préformatado (user)"/>
+  <w:style w:type="paragraph" w:styleId="Textoprformatado">
+    <w:name w:val="Texto préformatado"/>
     <w:basedOn w:val="Normal"/>
     <w:qFormat/>
     <w:pPr>

</xml_diff>

<commit_message>
atualizado sumario do material de ferramentas de desenvolvimento
</commit_message>
<xml_diff>
--- a/Aula2/Ferramentas_Desenvolvimento_Frontend.docx
+++ b/Aula2/Ferramentas_Desenvolvimento_Frontend.docx
@@ -525,11 +525,6 @@
                 <w:rStyle w:val="Vnculodendice"/>
               </w:rPr>
               <w:t>1. Cronograma da Aula</w:t>
-            </w:r>
-            <w:r>
-              <w:rPr>
-                <w:rStyle w:val="Vnculodendice"/>
-              </w:rPr>
               <w:tab/>
               <w:t>3</w:t>
             </w:r>
@@ -669,7 +664,7 @@
               <w:rPr>
                 <w:rStyle w:val="Vnculodendice"/>
               </w:rPr>
-              <w:t>Exercicio 2.1 — Primeiro projeto npm</w:t>
+              <w:t>Exercício 2.1 — Primeiro projeto npm</w:t>
               <w:tab/>
               <w:t>5</w:t>
             </w:r>
@@ -13417,15 +13412,15 @@
         <w:tblLook w:val="0000"/>
       </w:tblPr>
       <w:tblGrid>
-        <w:gridCol w:w="2194"/>
-        <w:gridCol w:w="3582"/>
+        <w:gridCol w:w="2193"/>
+        <w:gridCol w:w="3583"/>
         <w:gridCol w:w="3584"/>
       </w:tblGrid>
       <w:tr>
         <w:trPr/>
         <w:tc>
           <w:tcPr>
-            <w:tcW w:w="2194" w:type="dxa"/>
+            <w:tcW w:w="2193" w:type="dxa"/>
             <w:tcBorders>
               <w:top w:val="single" w:sz="2" w:space="0" w:color="CCCCCC"/>
               <w:left w:val="single" w:sz="2" w:space="0" w:color="CCCCCC"/>
@@ -13454,7 +13449,7 @@
         </w:tc>
         <w:tc>
           <w:tcPr>
-            <w:tcW w:w="3582" w:type="dxa"/>
+            <w:tcW w:w="3583" w:type="dxa"/>
             <w:tcBorders>
               <w:top w:val="single" w:sz="2" w:space="0" w:color="CCCCCC"/>
               <w:left w:val="single" w:sz="2" w:space="0" w:color="CCCCCC"/>
@@ -13515,7 +13510,7 @@
         <w:trPr/>
         <w:tc>
           <w:tcPr>
-            <w:tcW w:w="2194" w:type="dxa"/>
+            <w:tcW w:w="2193" w:type="dxa"/>
             <w:tcBorders>
               <w:top w:val="single" w:sz="2" w:space="0" w:color="CCCCCC"/>
               <w:left w:val="single" w:sz="2" w:space="0" w:color="CCCCCC"/>
@@ -13544,7 +13539,7 @@
         </w:tc>
         <w:tc>
           <w:tcPr>
-            <w:tcW w:w="3582" w:type="dxa"/>
+            <w:tcW w:w="3583" w:type="dxa"/>
             <w:tcBorders>
               <w:top w:val="single" w:sz="2" w:space="0" w:color="CCCCCC"/>
               <w:left w:val="single" w:sz="2" w:space="0" w:color="CCCCCC"/>
@@ -13601,7 +13596,7 @@
         <w:trPr/>
         <w:tc>
           <w:tcPr>
-            <w:tcW w:w="2194" w:type="dxa"/>
+            <w:tcW w:w="2193" w:type="dxa"/>
             <w:tcBorders>
               <w:top w:val="single" w:sz="2" w:space="0" w:color="CCCCCC"/>
               <w:left w:val="single" w:sz="2" w:space="0" w:color="CCCCCC"/>
@@ -13630,7 +13625,7 @@
         </w:tc>
         <w:tc>
           <w:tcPr>
-            <w:tcW w:w="3582" w:type="dxa"/>
+            <w:tcW w:w="3583" w:type="dxa"/>
             <w:tcBorders>
               <w:top w:val="single" w:sz="2" w:space="0" w:color="CCCCCC"/>
               <w:left w:val="single" w:sz="2" w:space="0" w:color="CCCCCC"/>
@@ -13687,7 +13682,7 @@
         <w:trPr/>
         <w:tc>
           <w:tcPr>
-            <w:tcW w:w="2194" w:type="dxa"/>
+            <w:tcW w:w="2193" w:type="dxa"/>
             <w:tcBorders>
               <w:top w:val="single" w:sz="2" w:space="0" w:color="CCCCCC"/>
               <w:left w:val="single" w:sz="2" w:space="0" w:color="CCCCCC"/>
@@ -13716,7 +13711,7 @@
         </w:tc>
         <w:tc>
           <w:tcPr>
-            <w:tcW w:w="3582" w:type="dxa"/>
+            <w:tcW w:w="3583" w:type="dxa"/>
             <w:tcBorders>
               <w:top w:val="single" w:sz="2" w:space="0" w:color="CCCCCC"/>
               <w:left w:val="single" w:sz="2" w:space="0" w:color="CCCCCC"/>
@@ -13773,7 +13768,7 @@
         <w:trPr/>
         <w:tc>
           <w:tcPr>
-            <w:tcW w:w="2194" w:type="dxa"/>
+            <w:tcW w:w="2193" w:type="dxa"/>
             <w:tcBorders>
               <w:top w:val="single" w:sz="2" w:space="0" w:color="CCCCCC"/>
               <w:left w:val="single" w:sz="2" w:space="0" w:color="CCCCCC"/>
@@ -13802,7 +13797,7 @@
         </w:tc>
         <w:tc>
           <w:tcPr>
-            <w:tcW w:w="3582" w:type="dxa"/>
+            <w:tcW w:w="3583" w:type="dxa"/>
             <w:tcBorders>
               <w:top w:val="single" w:sz="2" w:space="0" w:color="CCCCCC"/>
               <w:left w:val="single" w:sz="2" w:space="0" w:color="CCCCCC"/>
@@ -13859,7 +13854,7 @@
         <w:trPr/>
         <w:tc>
           <w:tcPr>
-            <w:tcW w:w="2194" w:type="dxa"/>
+            <w:tcW w:w="2193" w:type="dxa"/>
             <w:tcBorders>
               <w:top w:val="single" w:sz="2" w:space="0" w:color="CCCCCC"/>
               <w:left w:val="single" w:sz="2" w:space="0" w:color="CCCCCC"/>
@@ -13888,7 +13883,7 @@
         </w:tc>
         <w:tc>
           <w:tcPr>
-            <w:tcW w:w="3582" w:type="dxa"/>
+            <w:tcW w:w="3583" w:type="dxa"/>
             <w:tcBorders>
               <w:top w:val="single" w:sz="2" w:space="0" w:color="CCCCCC"/>
               <w:left w:val="single" w:sz="2" w:space="0" w:color="CCCCCC"/>
@@ -13945,7 +13940,7 @@
         <w:trPr/>
         <w:tc>
           <w:tcPr>
-            <w:tcW w:w="2194" w:type="dxa"/>
+            <w:tcW w:w="2193" w:type="dxa"/>
             <w:tcBorders>
               <w:top w:val="single" w:sz="2" w:space="0" w:color="CCCCCC"/>
               <w:left w:val="single" w:sz="2" w:space="0" w:color="CCCCCC"/>
@@ -13974,7 +13969,7 @@
         </w:tc>
         <w:tc>
           <w:tcPr>
-            <w:tcW w:w="3582" w:type="dxa"/>
+            <w:tcW w:w="3583" w:type="dxa"/>
             <w:tcBorders>
               <w:top w:val="single" w:sz="2" w:space="0" w:color="CCCCCC"/>
               <w:left w:val="single" w:sz="2" w:space="0" w:color="CCCCCC"/>
@@ -14031,7 +14026,7 @@
         <w:trPr/>
         <w:tc>
           <w:tcPr>
-            <w:tcW w:w="2194" w:type="dxa"/>
+            <w:tcW w:w="2193" w:type="dxa"/>
             <w:tcBorders>
               <w:top w:val="single" w:sz="2" w:space="0" w:color="CCCCCC"/>
               <w:left w:val="single" w:sz="2" w:space="0" w:color="CCCCCC"/>
@@ -14060,7 +14055,7 @@
         </w:tc>
         <w:tc>
           <w:tcPr>
-            <w:tcW w:w="3582" w:type="dxa"/>
+            <w:tcW w:w="3583" w:type="dxa"/>
             <w:tcBorders>
               <w:top w:val="single" w:sz="2" w:space="0" w:color="CCCCCC"/>
               <w:left w:val="single" w:sz="2" w:space="0" w:color="CCCCCC"/>
@@ -16730,7 +16725,7 @@
   </w:style>
   <w:style w:type="paragraph" w:styleId="Heading1">
     <w:name w:val="heading 1"/>
-    <w:basedOn w:val="Ttulo"/>
+    <w:basedOn w:val="Ttulouser"/>
     <w:qFormat/>
     <w:pPr>
       <w:spacing w:before="360" w:after="200"/>
@@ -16747,7 +16742,7 @@
   </w:style>
   <w:style w:type="paragraph" w:styleId="Heading2">
     <w:name w:val="heading 2"/>
-    <w:basedOn w:val="Ttulo"/>
+    <w:basedOn w:val="Ttulouser"/>
     <w:qFormat/>
     <w:pPr>
       <w:spacing w:before="280" w:after="120"/>
@@ -16764,7 +16759,7 @@
   </w:style>
   <w:style w:type="paragraph" w:styleId="Heading3">
     <w:name w:val="heading 3"/>
-    <w:basedOn w:val="Ttulo"/>
+    <w:basedOn w:val="Ttulouser"/>
     <w:qFormat/>
     <w:pPr>
       <w:spacing w:before="200" w:after="80"/>
@@ -16781,7 +16776,7 @@
   </w:style>
   <w:style w:type="paragraph" w:styleId="Heading4">
     <w:name w:val="heading 4"/>
-    <w:basedOn w:val="Ttulo"/>
+    <w:basedOn w:val="Ttulouser"/>
     <w:qFormat/>
     <w:pPr/>
     <w:rPr>
@@ -16792,7 +16787,7 @@
   </w:style>
   <w:style w:type="paragraph" w:styleId="Heading5">
     <w:name w:val="heading 5"/>
-    <w:basedOn w:val="Ttulo"/>
+    <w:basedOn w:val="Ttulouser"/>
     <w:qFormat/>
     <w:pPr/>
     <w:rPr>
@@ -16801,7 +16796,7 @@
   </w:style>
   <w:style w:type="paragraph" w:styleId="Heading6">
     <w:name w:val="heading 6"/>
-    <w:basedOn w:val="Ttulo"/>
+    <w:basedOn w:val="Ttulouser"/>
     <w:qFormat/>
     <w:pPr/>
     <w:rPr>
@@ -16817,8 +16812,8 @@
       <w:u w:val="single"/>
     </w:rPr>
   </w:style>
-  <w:style w:type="character" w:styleId="Caracteresdenotaderodap">
-    <w:name w:val="Caracteres de nota de rodapé"/>
+  <w:style w:type="character" w:styleId="Caracteresdenotaderodapuser">
+    <w:name w:val="Caracteres de nota de rodapé (user)"/>
     <w:uiPriority w:val="99"/>
     <w:semiHidden/>
     <w:unhideWhenUsed/>
@@ -16827,8 +16822,8 @@
       <w:vertAlign w:val="superscript"/>
     </w:rPr>
   </w:style>
-  <w:style w:type="character" w:styleId="Caracteresdenotaderodapuser">
-    <w:name w:val="Caracteres de nota de rodapé (user)"/>
+  <w:style w:type="character" w:styleId="Caracteresdenotaderodap">
+    <w:name w:val="Caracteres de nota de rodapé"/>
     <w:qFormat/>
     <w:rPr>
       <w:vertAlign w:val="superscript"/>
@@ -16851,30 +16846,30 @@
       <w:szCs w:val="20"/>
     </w:rPr>
   </w:style>
-  <w:style w:type="character" w:styleId="Smbolosdenumerao">
-    <w:name w:val="Símbolos de numeração"/>
+  <w:style w:type="character" w:styleId="Smbolosdenumeraouser">
+    <w:name w:val="Símbolos de numeração (user)"/>
     <w:qFormat/>
     <w:rPr/>
+  </w:style>
+  <w:style w:type="character" w:styleId="Vnculodendice">
+    <w:name w:val="Vínculo de índice"/>
+    <w:qFormat/>
+    <w:rPr/>
+  </w:style>
+  <w:style w:type="character" w:styleId="Marcadores">
+    <w:name w:val="Marcadores"/>
+    <w:qFormat/>
+    <w:rPr>
+      <w:rFonts w:ascii="OpenSymbol" w:hAnsi="OpenSymbol" w:eastAsia="OpenSymbol" w:cs="OpenSymbol"/>
+    </w:rPr>
   </w:style>
   <w:style w:type="character" w:styleId="Vnculodendiceuser">
     <w:name w:val="Vínculo de índice (user)"/>
     <w:qFormat/>
     <w:rPr/>
   </w:style>
-  <w:style w:type="character" w:styleId="Marcadoresuser">
-    <w:name w:val="Marcadores (user)"/>
-    <w:qFormat/>
-    <w:rPr>
-      <w:rFonts w:ascii="OpenSymbol" w:hAnsi="OpenSymbol" w:eastAsia="OpenSymbol" w:cs="OpenSymbol"/>
-    </w:rPr>
-  </w:style>
-  <w:style w:type="character" w:styleId="Vnculodendice">
-    <w:name w:val="Vínculo de índice"/>
-    <w:qFormat/>
-    <w:rPr/>
-  </w:style>
-  <w:style w:type="character" w:styleId="Cdigo-fonteuser">
-    <w:name w:val="Código-fonte (user)"/>
+  <w:style w:type="character" w:styleId="Cdigo-fonte">
+    <w:name w:val="Código-fonte"/>
     <w:qFormat/>
     <w:rPr>
       <w:rFonts w:ascii="Liberation Mono" w:hAnsi="Liberation Mono" w:eastAsia="Noto Sans Mono CJK SC" w:cs="Liberation Mono"/>
@@ -16966,7 +16961,7 @@
   </w:style>
   <w:style w:type="paragraph" w:styleId="Title">
     <w:name w:val="Title"/>
-    <w:basedOn w:val="Ttulo"/>
+    <w:basedOn w:val="Ttulouser"/>
     <w:qFormat/>
     <w:pPr/>
     <w:rPr>
@@ -17029,6 +17024,13 @@
       <w:szCs w:val="20"/>
     </w:rPr>
   </w:style>
+  <w:style w:type="paragraph" w:styleId="Cabealhoerodapuser">
+    <w:name w:val="Cabeçalho e rodapé (user)"/>
+    <w:basedOn w:val="Normal"/>
+    <w:qFormat/>
+    <w:pPr/>
+    <w:rPr/>
+  </w:style>
   <w:style w:type="paragraph" w:styleId="Cabealhoerodap">
     <w:name w:val="Cabeçalho e rodapé"/>
     <w:basedOn w:val="Normal"/>
@@ -17036,28 +17038,21 @@
     <w:pPr/>
     <w:rPr/>
   </w:style>
-  <w:style w:type="paragraph" w:styleId="Cabealhoerodapuser">
-    <w:name w:val="Cabeçalho e rodapé (user)"/>
-    <w:basedOn w:val="Normal"/>
-    <w:qFormat/>
-    <w:pPr/>
-    <w:rPr/>
-  </w:style>
   <w:style w:type="paragraph" w:styleId="Header">
     <w:name w:val="header"/>
-    <w:basedOn w:val="Cabealhoerodap"/>
+    <w:basedOn w:val="Cabealhoerodapuser"/>
     <w:pPr/>
     <w:rPr/>
   </w:style>
   <w:style w:type="paragraph" w:styleId="Footer">
     <w:name w:val="footer"/>
-    <w:basedOn w:val="Cabealhoerodap"/>
+    <w:basedOn w:val="Cabealhoerodapuser"/>
     <w:pPr/>
     <w:rPr/>
   </w:style>
   <w:style w:type="paragraph" w:styleId="IndexHeading">
     <w:name w:val="index heading"/>
-    <w:basedOn w:val="Ttulouser"/>
+    <w:basedOn w:val="Ttulo"/>
     <w:pPr>
       <w:suppressLineNumbers/>
       <w:ind w:hanging="0" w:left="0"/>
@@ -17086,7 +17081,7 @@
   </w:style>
   <w:style w:type="paragraph" w:styleId="TOC1">
     <w:name w:val="toc 1"/>
-    <w:basedOn w:val="ndiceuser"/>
+    <w:basedOn w:val="ndice"/>
     <w:pPr>
       <w:tabs>
         <w:tab w:val="clear" w:pos="720"/>
@@ -17098,7 +17093,7 @@
   </w:style>
   <w:style w:type="paragraph" w:styleId="TOC2">
     <w:name w:val="toc 2"/>
-    <w:basedOn w:val="ndiceuser"/>
+    <w:basedOn w:val="ndice"/>
     <w:pPr>
       <w:tabs>
         <w:tab w:val="clear" w:pos="720"/>
@@ -17110,7 +17105,7 @@
   </w:style>
   <w:style w:type="paragraph" w:styleId="TOC3">
     <w:name w:val="toc 3"/>
-    <w:basedOn w:val="ndiceuser"/>
+    <w:basedOn w:val="ndice"/>
     <w:pPr>
       <w:tabs>
         <w:tab w:val="clear" w:pos="720"/>
@@ -17120,8 +17115,8 @@
     </w:pPr>
     <w:rPr/>
   </w:style>
-  <w:style w:type="paragraph" w:styleId="Textoprformatadouser">
-    <w:name w:val="Texto préformatado (user)"/>
+  <w:style w:type="paragraph" w:styleId="Textoprformatado">
+    <w:name w:val="Texto préformatado"/>
     <w:basedOn w:val="Normal"/>
     <w:qFormat/>
     <w:pPr>

</xml_diff>